<commit_message>
Add final video, subtitles, script documents, project zip and verification report
</commit_message>
<xml_diff>
--- a/docs/script/From-Farmland-to-Token-Script.docx
+++ b/docs/script/From-Farmland-to-Token-Script.docx
@@ -338,6 +338,9 @@
         <w:gridCol w:w="2960"/>
       </w:tblGrid>
       <w:tr>
+        <w:trPr>
+          <w:tblHeader w:val="true"/>
+        </w:trPr>
         <w:tc>
           <w:tcPr>
             <w:tcW w:type="dxa" w:w="1134"/>
@@ -597,7 +600,7 @@
                 <w:color w:val="5E6270"/>
                 <w:sz w:val="16"/>
               </w:rPr>
-              <w:t>Dark slate opening. A single token outline draws itself, then the journey rail appears: four stops labelled Set up, Investors, Issue, Transfer.</w:t>
+              <w:t>Dark slate opening. A token draws itself and fills with Tokeniser mint, the title appears, then a four stop journey rail (Set up, Investors, Issue, Transfer) draws in. The dark layer lifts away and the rail settles at the top right, where it tracks progress for the rest of the video.</w:t>
             </w:r>
           </w:p>
         </w:tc>
@@ -799,7 +802,7 @@
                 <w:color w:val="5E6270"/>
                 <w:sz w:val="16"/>
               </w:rPr>
-              <w:t>Isometric farmland draws in line by line inside a frame labelled as the fund. A row of unit tiles sits beneath it, linked to investors. The register appears as three disconnected documents with a lagging clock.</w:t>
+              <w:t>Isometric farmland builds up parcel by parcel inside a dashed frame that marks the fund. A row of unit tiles appears below it, linked to three investors. On the right, the register today appears as three separate documents (spreadsheet, email, admin system) with broken links between them and a clock.</w:t>
             </w:r>
           </w:p>
         </w:tc>
@@ -923,7 +926,7 @@
                 <w:color w:val="5E6270"/>
                 <w:sz w:val="16"/>
               </w:rPr>
-              <w:t>The farmland stays exactly where it is. The unit tiles lift out of the old register and turn into tokens. A small rules mark settles into each token.</w:t>
+              <w:t>The farmland stays where it is and the old register fades. The unit tiles lift and turn into tokens. A small rules badge settles onto each token.</w:t>
             </w:r>
           </w:p>
         </w:tc>
@@ -1099,7 +1102,7 @@
                 <w:color w:val="5E6270"/>
                 <w:sz w:val="16"/>
               </w:rPr>
-              <w:t>A light Tokeniser platform layer slides in. The camera tilts down to reveal the dark Redbelly Network layer running underneath it. These two layers stay on screen as the stage for the four steps.</w:t>
+              <w:t>A Tokeniser platform window slides in and the tokens settle into it. Then the dark Redbelly Network layer rises in underneath the window, with the Redbelly logo and a chain of blocks. These two layers stay on screen as the stage for the four steps.</w:t>
             </w:r>
           </w:p>
         </w:tc>
@@ -1314,7 +1317,7 @@
                 <w:color w:val="5E6270"/>
                 <w:sz w:val="16"/>
               </w:rPr>
-              <w:t>On the Tokeniser layer, a fund setup card ticks Fund verified. Rule chips snap into the token one by one and lock in.</w:t>
+              <w:t>In the platform window, the fund setup card changes from Pending to Fund verified. Two rule chips, Wholesale investors only and Transfer restrictions, appear and fly to the token, which gains a rules badge and a lock.</w:t>
             </w:r>
           </w:p>
         </w:tc>
@@ -1516,7 +1519,7 @@
                 <w:color w:val="5E6270"/>
                 <w:sz w:val="16"/>
               </w:rPr>
-              <w:t>Three investors pass through a verification gate. Two are verified and receive a wallet that drops onto the Redbelly layer. A third is not verified and gets no wallet.</w:t>
+              <w:t>A verification scan labelled Averer passes over three investor cards. Two investors are verified and their wallets drop onto the Redbelly Network layer. The third is not verified and gets no wallet and no tokens.</w:t>
             </w:r>
           </w:p>
         </w:tc>
@@ -1692,7 +1695,7 @@
                 <w:color w:val="5E6270"/>
                 <w:sz w:val="16"/>
               </w:rPr>
-              <w:t>Tokens are minted on the Redbelly layer and travel up into the verified wallets. The register panel fills its rows at the same moment.</w:t>
+              <w:t>A block on the Redbelly Network layer lights up and tokens are minted from it into the two verified wallets. At the same moment the register in the platform window fills in and marks each row Updated.</w:t>
             </w:r>
           </w:p>
         </w:tc>
@@ -1894,7 +1897,7 @@
                 <w:color w:val="5E6270"/>
                 <w:sz w:val="16"/>
               </w:rPr>
-              <w:t>A holder tries to send a token to an ineligible investor. It reaches the rules check, the check fails and the token returns to its holder.</w:t>
+              <w:t>A token leaves the first wallet for the rules check in the platform window, addressed to an ineligible investor. The Wholesale investors only rule fails, the transfer is stamped Rejected and the token returns to its wallet. Nothing reaches the network.</w:t>
             </w:r>
           </w:p>
         </w:tc>
@@ -2057,7 +2060,7 @@
                 <w:color w:val="5E6270"/>
                 <w:sz w:val="16"/>
               </w:rPr>
-              <w:t>A transfer to an eligible investor passes every check. Token and payment cross on the Redbelly layer at the same moment and a final seal locks the block.</w:t>
+              <w:t>The same token is sent to an eligible investor. Both rules pass. On the Redbelly Network layer the token and the payment cross between the two wallets at the same block, which then locks and is marked Final.</w:t>
             </w:r>
           </w:p>
         </w:tc>
@@ -2298,7 +2301,7 @@
                 <w:color w:val="5E6270"/>
                 <w:sz w:val="16"/>
               </w:rPr>
-              <w:t>The events of the last two steps stack into one audit record that stays current, then fans out to three readers.</w:t>
+              <w:t>The platform window shows an audit log: a check, a transfer and a rejection, each marked Recorded, while matching blocks lock on the network layer. Two readers, Auditors and Regulators, connect to the log.</w:t>
             </w:r>
           </w:p>
         </w:tc>
@@ -2435,7 +2438,7 @@
                 <w:color w:val="5E6270"/>
                 <w:sz w:val="16"/>
               </w:rPr>
-              <w:t>The camera pulls back to the farmland from the opening, now linked to its tokens on the Redbelly layer. All four rail stops are complete.</w:t>
+              <w:t>The farmland returns at the top, unchanged, linked by dashed lines to the tokens held in the wallets on the Redbelly Network layer. All four steps on the rail are complete.</w:t>
             </w:r>
           </w:p>
         </w:tc>
@@ -2559,7 +2562,7 @@
                 <w:color w:val="5E6270"/>
                 <w:sz w:val="16"/>
               </w:rPr>
-              <w:t>Tokeniser logo above the Redbelly Network logo on a calm slate end card, with the web address and the illustrative example note.</w:t>
+              <w:t>Calm slate end card: the Tokeniser logo, Built on Redbelly Network with the Redbelly Network logo, tokeniser.com and the illustrative example note.</w:t>
             </w:r>
           </w:p>
         </w:tc>
@@ -2611,6 +2614,9 @@
         <w:gridCol w:w="3699"/>
       </w:tblGrid>
       <w:tr>
+        <w:trPr>
+          <w:tblHeader w:val="true"/>
+        </w:trPr>
         <w:tc>
           <w:tcPr>
             <w:tcW w:type="dxa" w:w="907"/>

</xml_diff>